<commit_message>
mise en place docker pour la production et retravail de lisibilité du dossier de passation
</commit_message>
<xml_diff>
--- a/docs/tests-parcours-public-rest.docx
+++ b/docs/tests-parcours-public-rest.docx
@@ -5,13 +5,26 @@
     <w:p>
       <w:pPr>
         <w:pStyle w:val="Titre1"/>
+        <w:spacing w:before="40" w:after="320" w:line="276" w:lineRule="auto"/>
+        <w:ind w:left="227" w:right="227"/>
+        <w:shd w:val="clear" w:color="auto" w:fill="02223F"/>
       </w:pPr>
       <w:bookmarkStart w:id="0" w:name="X49c51c7c4e1ab29053d375fa35d2f753b6e0b2a"/>
       <w:r>
+        <w:rPr>
+          <w:rFonts w:ascii="Segoe UI" w:hAnsi="Segoe UI" w:cs="Segoe UI" w:eastAsia="Segoe UI"/>
+          <w:b/>
+          <w:color w:val="FFFFFF"/>
+          <w:sz w:val="52"/>
+        </w:rPr>
         <w:t>Guide de test — parcours grand public (mode rest)</w:t>
       </w:r>
     </w:p>
     <w:p>
+      <w:pPr>
+        <w:spacing w:before="0" w:after="40" w:line="240" w:lineRule="auto"/>
+        <w:ind w:left="0" w:right="0"/>
+      </w:pPr>
       <w:r>
         <w:pict w14:anchorId="3A3BE92D">
           <v:rect id="_x0000_i1025" style="width:0;height:1.5pt" o:hralign="center" o:hrstd="t" o:hr="t"/>
@@ -21,9 +34,20 @@
     <w:p>
       <w:pPr>
         <w:pStyle w:val="Titre2"/>
+        <w:spacing w:before="400" w:after="160" w:line="276" w:lineRule="auto"/>
+        <w:ind w:left="0" w:right="0"/>
+        <w:pBdr>
+          <w:bottom w:val="single" w:sz="18" w:space="8" w:color="007A8C"/>
+        </w:pBdr>
       </w:pPr>
       <w:bookmarkStart w:id="1" w:name="avant-de-commencer"/>
       <w:r>
+        <w:rPr>
+          <w:rFonts w:ascii="Segoe UI" w:hAnsi="Segoe UI" w:cs="Segoe UI" w:eastAsia="Segoe UI"/>
+          <w:b/>
+          <w:color w:val="02223F"/>
+          <w:sz w:val="36"/>
+        </w:rPr>
         <w:t>Avant de commencer</w:t>
       </w:r>
     </w:p>
@@ -34,17 +58,35 @@
           <w:ilvl w:val="0"/>
           <w:numId w:val="2"/>
         </w:numPr>
-      </w:pPr>
-      <w:r>
+        <w:spacing w:before="20" w:after="120" w:line="312" w:lineRule="auto"/>
+        <w:ind w:left="198" w:right="0"/>
+      </w:pPr>
+      <w:r>
+        <w:rPr>
+          <w:rFonts w:ascii="Segoe UI" w:hAnsi="Segoe UI" w:cs="Segoe UI" w:eastAsia="Segoe UI"/>
+          <w:b w:val="0"/>
+          <w:color w:val="0A192F"/>
+          <w:sz w:val="26"/>
+        </w:rPr>
         <w:t xml:space="preserve">Ouvrez le site à l’adresse indiquée par l’équipe (en général </w:t>
       </w:r>
       <w:r>
         <w:rPr>
           <w:rStyle w:val="VerbatimChar"/>
+          <w:rFonts w:ascii="Segoe UI" w:hAnsi="Segoe UI" w:cs="Segoe UI" w:eastAsia="Segoe UI"/>
+          <w:b w:val="0"/>
+          <w:color w:val="0A192F"/>
+          <w:sz w:val="26"/>
         </w:rPr>
         <w:t>http://localhost:5173</w:t>
       </w:r>
       <w:r>
+        <w:rPr>
+          <w:rFonts w:ascii="Segoe UI" w:hAnsi="Segoe UI" w:cs="Segoe UI" w:eastAsia="Segoe UI"/>
+          <w:b w:val="0"/>
+          <w:color w:val="0A192F"/>
+          <w:sz w:val="26"/>
+        </w:rPr>
         <w:t>).</w:t>
       </w:r>
     </w:p>
@@ -55,8 +97,16 @@
           <w:ilvl w:val="0"/>
           <w:numId w:val="2"/>
         </w:numPr>
-      </w:pPr>
-      <w:r>
+        <w:spacing w:before="20" w:after="120" w:line="312" w:lineRule="auto"/>
+        <w:ind w:left="198" w:right="0"/>
+      </w:pPr>
+      <w:r>
+        <w:rPr>
+          <w:rFonts w:ascii="Segoe UI" w:hAnsi="Segoe UI" w:cs="Segoe UI" w:eastAsia="Segoe UI"/>
+          <w:b w:val="0"/>
+          <w:color w:val="0A192F"/>
+          <w:sz w:val="26"/>
+        </w:rPr>
         <w:t>La navigation privée est recommandée : session propre, sans historique ni extensions parasites.</w:t>
       </w:r>
     </w:p>
@@ -67,8 +117,16 @@
           <w:ilvl w:val="0"/>
           <w:numId w:val="2"/>
         </w:numPr>
-      </w:pPr>
-      <w:r>
+        <w:spacing w:before="20" w:after="120" w:line="312" w:lineRule="auto"/>
+        <w:ind w:left="198" w:right="0"/>
+      </w:pPr>
+      <w:r>
+        <w:rPr>
+          <w:rFonts w:ascii="Segoe UI" w:hAnsi="Segoe UI" w:cs="Segoe UI" w:eastAsia="Segoe UI"/>
+          <w:b w:val="0"/>
+          <w:color w:val="0A192F"/>
+          <w:sz w:val="26"/>
+        </w:rPr>
         <w:t>Pour chaque étape : faites l’action demandée, puis répondez à la question (quelques phrases suffisent).</w:t>
       </w:r>
     </w:p>
@@ -79,35 +137,68 @@
           <w:ilvl w:val="0"/>
           <w:numId w:val="2"/>
         </w:numPr>
-      </w:pPr>
-      <w:r>
+        <w:spacing w:before="20" w:after="120" w:line="312" w:lineRule="auto"/>
+        <w:ind w:left="198" w:right="0"/>
+      </w:pPr>
+      <w:r>
+        <w:rPr>
+          <w:rFonts w:ascii="Segoe UI" w:hAnsi="Segoe UI" w:cs="Segoe UI" w:eastAsia="Segoe UI"/>
+          <w:b w:val="0"/>
+          <w:color w:val="0A192F"/>
+          <w:sz w:val="26"/>
+        </w:rPr>
         <w:t>Notez aussi tout ce qui vous bloque, vous surprend ou vous irrite, même hors liste.</w:t>
       </w:r>
     </w:p>
     <w:p>
       <w:pPr>
         <w:pStyle w:val="Titre3"/>
+        <w:spacing w:before="320" w:after="120" w:line="288" w:lineRule="auto"/>
+        <w:ind w:left="0" w:right="0"/>
       </w:pPr>
       <w:bookmarkStart w:id="2" w:name="ce-que-vous-ne-testez-pas-aujourdhui"/>
       <w:r>
+        <w:rPr>
+          <w:rFonts w:ascii="Segoe UI" w:hAnsi="Segoe UI" w:cs="Segoe UI" w:eastAsia="Segoe UI"/>
+          <w:b/>
+          <w:color w:val="007A8C"/>
+          <w:sz w:val="30"/>
+        </w:rPr>
         <w:t>Ce que vous ne testez pas aujourd’hui</w:t>
       </w:r>
     </w:p>
     <w:p>
       <w:pPr>
         <w:pStyle w:val="FirstParagraph"/>
-      </w:pPr>
-      <w:r>
+        <w:spacing w:before="40" w:after="160" w:line="324" w:lineRule="auto"/>
+        <w:ind w:left="0" w:right="0"/>
+      </w:pPr>
+      <w:r>
+        <w:rPr>
+          <w:rFonts w:ascii="Segoe UI" w:hAnsi="Segoe UI" w:cs="Segoe UI" w:eastAsia="Segoe UI"/>
+          <w:b w:val="0"/>
+          <w:color w:val="0A192F"/>
+          <w:sz w:val="26"/>
+        </w:rPr>
         <w:t xml:space="preserve">Ces parties ne sont </w:t>
       </w:r>
       <w:r>
         <w:rPr>
+          <w:rFonts w:ascii="Segoe UI" w:hAnsi="Segoe UI" w:cs="Segoe UI" w:eastAsia="Segoe UI"/>
           <w:b/>
           <w:bCs/>
+          <w:color w:val="0A192F"/>
+          <w:sz w:val="26"/>
         </w:rPr>
         <w:t>pas</w:t>
       </w:r>
       <w:r>
+        <w:rPr>
+          <w:rFonts w:ascii="Segoe UI" w:hAnsi="Segoe UI" w:cs="Segoe UI" w:eastAsia="Segoe UI"/>
+          <w:b w:val="0"/>
+          <w:color w:val="0A192F"/>
+          <w:sz w:val="26"/>
+        </w:rPr>
         <w:t xml:space="preserve"> à tester (elles ne sont pas prêtes pour le grand public en mode rest) :</w:t>
       </w:r>
     </w:p>
@@ -118,8 +209,16 @@
           <w:ilvl w:val="0"/>
           <w:numId w:val="3"/>
         </w:numPr>
-      </w:pPr>
-      <w:r>
+        <w:spacing w:before="20" w:after="120" w:line="312" w:lineRule="auto"/>
+        <w:ind w:left="198" w:right="0"/>
+      </w:pPr>
+      <w:r>
+        <w:rPr>
+          <w:rFonts w:ascii="Segoe UI" w:hAnsi="Segoe UI" w:cs="Segoe UI" w:eastAsia="Segoe UI"/>
+          <w:b w:val="0"/>
+          <w:color w:val="0A192F"/>
+          <w:sz w:val="26"/>
+        </w:rPr>
         <w:t>Création de compte / inscription</w:t>
       </w:r>
     </w:p>
@@ -130,8 +229,16 @@
           <w:ilvl w:val="0"/>
           <w:numId w:val="3"/>
         </w:numPr>
-      </w:pPr>
-      <w:r>
+        <w:spacing w:before="20" w:after="120" w:line="312" w:lineRule="auto"/>
+        <w:ind w:left="198" w:right="0"/>
+      </w:pPr>
+      <w:r>
+        <w:rPr>
+          <w:rFonts w:ascii="Segoe UI" w:hAnsi="Segoe UI" w:cs="Segoe UI" w:eastAsia="Segoe UI"/>
+          <w:b w:val="0"/>
+          <w:color w:val="0A192F"/>
+          <w:sz w:val="26"/>
+        </w:rPr>
         <w:t>Connexion et espace chercheur</w:t>
       </w:r>
     </w:p>
@@ -142,8 +249,16 @@
           <w:ilvl w:val="0"/>
           <w:numId w:val="3"/>
         </w:numPr>
-      </w:pPr>
-      <w:r>
+        <w:spacing w:before="20" w:after="120" w:line="312" w:lineRule="auto"/>
+        <w:ind w:left="198" w:right="0"/>
+      </w:pPr>
+      <w:r>
+        <w:rPr>
+          <w:rFonts w:ascii="Segoe UI" w:hAnsi="Segoe UI" w:cs="Segoe UI" w:eastAsia="Segoe UI"/>
+          <w:b w:val="0"/>
+          <w:color w:val="0A192F"/>
+          <w:sz w:val="26"/>
+        </w:rPr>
         <w:t>Fiche d’un chercheur individuel (profil privé)</w:t>
       </w:r>
     </w:p>
@@ -154,12 +269,24 @@
           <w:ilvl w:val="0"/>
           <w:numId w:val="3"/>
         </w:numPr>
-      </w:pPr>
-      <w:r>
+        <w:spacing w:before="20" w:after="120" w:line="312" w:lineRule="auto"/>
+        <w:ind w:left="198" w:right="0"/>
+      </w:pPr>
+      <w:r>
+        <w:rPr>
+          <w:rFonts w:ascii="Segoe UI" w:hAnsi="Segoe UI" w:cs="Segoe UI" w:eastAsia="Segoe UI"/>
+          <w:b w:val="0"/>
+          <w:color w:val="0A192F"/>
+          <w:sz w:val="26"/>
+        </w:rPr>
         <w:t>Assistant conversationnel / chat</w:t>
       </w:r>
     </w:p>
     <w:p>
+      <w:pPr>
+        <w:spacing w:before="0" w:after="40" w:line="240" w:lineRule="auto"/>
+        <w:ind w:left="0" w:right="0"/>
+      </w:pPr>
       <w:r>
         <w:pict w14:anchorId="276D47FA">
           <v:rect id="_x0000_i1026" style="width:0;height:1.5pt" o:hralign="center" o:hrstd="t" o:hr="t"/>
@@ -169,68 +296,124 @@
     <w:p>
       <w:pPr>
         <w:pStyle w:val="Titre2"/>
+        <w:spacing w:before="400" w:after="160" w:line="276" w:lineRule="auto"/>
+        <w:ind w:left="0" w:right="0"/>
+        <w:pBdr>
+          <w:bottom w:val="single" w:sz="18" w:space="8" w:color="007A8C"/>
+        </w:pBdr>
       </w:pPr>
       <w:bookmarkStart w:id="3" w:name="feuille-de-route-des-tests"/>
       <w:bookmarkEnd w:id="1"/>
       <w:bookmarkEnd w:id="2"/>
       <w:r>
+        <w:rPr>
+          <w:rFonts w:ascii="Segoe UI" w:hAnsi="Segoe UI" w:cs="Segoe UI" w:eastAsia="Segoe UI"/>
+          <w:b/>
+          <w:color w:val="02223F"/>
+          <w:sz w:val="36"/>
+        </w:rPr>
         <w:t>Feuille de route des tests</w:t>
       </w:r>
     </w:p>
     <w:p>
       <w:pPr>
         <w:pStyle w:val="Titre3"/>
+        <w:spacing w:before="320" w:after="120" w:line="288" w:lineRule="auto"/>
+        <w:ind w:left="0" w:right="0"/>
       </w:pPr>
       <w:bookmarkStart w:id="4" w:name="X267abf91675029355b459a79ea6a3a4cf36e9ef"/>
       <w:r>
+        <w:rPr>
+          <w:rFonts w:ascii="Segoe UI" w:hAnsi="Segoe UI" w:cs="Segoe UI" w:eastAsia="Segoe UI"/>
+          <w:b/>
+          <w:color w:val="007A8C"/>
+          <w:sz w:val="30"/>
+        </w:rPr>
         <w:t>Étape 1 — Première impression (page d’accueil)</w:t>
       </w:r>
     </w:p>
     <w:p>
       <w:pPr>
         <w:pStyle w:val="FirstParagraph"/>
-      </w:pPr>
-      <w:r>
-        <w:rPr>
+        <w:spacing w:before="40" w:after="160" w:line="324" w:lineRule="auto"/>
+        <w:ind w:left="0" w:right="0"/>
+      </w:pPr>
+      <w:r>
+        <w:rPr>
+          <w:rFonts w:ascii="Segoe UI" w:hAnsi="Segoe UI" w:cs="Segoe UI" w:eastAsia="Segoe UI"/>
           <w:b/>
           <w:bCs/>
+          <w:color w:val="0A192F"/>
+          <w:sz w:val="26"/>
         </w:rPr>
         <w:t>À faire</w:t>
       </w:r>
       <w:r>
+        <w:rPr>
+          <w:rFonts w:ascii="Segoe UI" w:hAnsi="Segoe UI" w:cs="Segoe UI" w:eastAsia="Segoe UI"/>
+          <w:b w:val="0"/>
+          <w:color w:val="0A192F"/>
+          <w:sz w:val="26"/>
+        </w:rPr>
         <w:t xml:space="preserve"> - Arriver sur la page d’accueil. - Regarder le haut de page (image, titre, boutons) sans encore cliquer partout. - Faire défiler un peu vers le bas.</w:t>
       </w:r>
     </w:p>
     <w:p>
       <w:pPr>
         <w:pStyle w:val="Corpsdetexte"/>
-      </w:pPr>
-      <w:r>
-        <w:rPr>
+        <w:spacing w:before="120" w:after="280" w:line="324" w:lineRule="auto"/>
+        <w:ind w:left="255" w:right="198"/>
+        <w:shd w:val="clear" w:color="auto" w:fill="F3ECDA"/>
+        <w:pBdr>
+          <w:left w:val="single" w:sz="18" w:space="8" w:color="007A8C"/>
+        </w:pBdr>
+      </w:pPr>
+      <w:r>
+        <w:rPr>
+          <w:rFonts w:ascii="Segoe UI" w:hAnsi="Segoe UI" w:cs="Segoe UI" w:eastAsia="Segoe UI"/>
           <w:b/>
           <w:bCs/>
+          <w:color w:val="0A192F"/>
+          <w:sz w:val="26"/>
         </w:rPr>
         <w:t xml:space="preserve">Question </w:t>
       </w:r>
       <w:r>
         <w:rPr>
+          <w:rFonts w:ascii="Segoe UI" w:hAnsi="Segoe UI" w:cs="Segoe UI" w:eastAsia="Segoe UI"/>
           <w:b/>
           <w:bCs/>
+          <w:color w:val="0A192F"/>
+          <w:sz w:val="26"/>
         </w:rPr>
         <w:t>:</w:t>
       </w:r>
       <w:r>
+        <w:rPr>
+          <w:rFonts w:ascii="Segoe UI" w:hAnsi="Segoe UI" w:cs="Segoe UI" w:eastAsia="Segoe UI"/>
+          <w:b w:val="0"/>
+          <w:color w:val="0A192F"/>
+          <w:sz w:val="26"/>
+        </w:rPr>
         <w:br/>
       </w:r>
       <w:r>
         <w:rPr>
+          <w:rFonts w:ascii="Segoe UI" w:hAnsi="Segoe UI" w:cs="Segoe UI" w:eastAsia="Segoe UI"/>
+          <w:b w:val="0"/>
           <w:i/>
           <w:iCs/>
+          <w:color w:val="0A192F"/>
+          <w:sz w:val="26"/>
         </w:rPr>
         <w:t>En arrivant sur cette page, qu’avez-vous compris immédiatement sur le but du site ? Qu’est-ce qui restait flou ?</w:t>
       </w:r>
     </w:p>
     <w:p>
+      <w:pPr>
+        <w:spacing w:before="0" w:after="40" w:line="240" w:lineRule="auto"/>
+        <w:ind w:left="0" w:right="0"/>
+      </w:pPr>
       <w:r>
         <w:pict w14:anchorId="266F197D">
           <v:rect id="_x0000_i1027" style="width:0;height:1.5pt" o:hralign="center" o:hrstd="t" o:hr="t"/>
@@ -240,58 +423,103 @@
     <w:p>
       <w:pPr>
         <w:pStyle w:val="Titre3"/>
+        <w:spacing w:before="320" w:after="120" w:line="288" w:lineRule="auto"/>
+        <w:ind w:left="0" w:right="0"/>
       </w:pPr>
       <w:bookmarkStart w:id="5" w:name="étape-2-langue-français-anglais"/>
       <w:bookmarkEnd w:id="4"/>
       <w:r>
+        <w:rPr>
+          <w:rFonts w:ascii="Segoe UI" w:hAnsi="Segoe UI" w:cs="Segoe UI" w:eastAsia="Segoe UI"/>
+          <w:b/>
+          <w:color w:val="007A8C"/>
+          <w:sz w:val="30"/>
+        </w:rPr>
         <w:t>Étape 2 — Langue (français / anglais)</w:t>
       </w:r>
     </w:p>
     <w:p>
       <w:pPr>
         <w:pStyle w:val="FirstParagraph"/>
-      </w:pPr>
-      <w:r>
-        <w:rPr>
+        <w:spacing w:before="40" w:after="160" w:line="324" w:lineRule="auto"/>
+        <w:ind w:left="0" w:right="0"/>
+      </w:pPr>
+      <w:r>
+        <w:rPr>
+          <w:rFonts w:ascii="Segoe UI" w:hAnsi="Segoe UI" w:cs="Segoe UI" w:eastAsia="Segoe UI"/>
           <w:b/>
           <w:bCs/>
+          <w:color w:val="0A192F"/>
+          <w:sz w:val="26"/>
         </w:rPr>
         <w:t>À faire</w:t>
       </w:r>
       <w:r>
+        <w:rPr>
+          <w:rFonts w:ascii="Segoe UI" w:hAnsi="Segoe UI" w:cs="Segoe UI" w:eastAsia="Segoe UI"/>
+          <w:b w:val="0"/>
+          <w:color w:val="0A192F"/>
+          <w:sz w:val="26"/>
+        </w:rPr>
         <w:t xml:space="preserve"> - Trouver le bouton de langue (souvent FR / EN en haut à droite). - Passer en anglais, regarder l’accueil, puis revenir en français.</w:t>
       </w:r>
     </w:p>
     <w:p>
       <w:pPr>
         <w:pStyle w:val="Corpsdetexte"/>
-      </w:pPr>
-      <w:r>
-        <w:rPr>
+        <w:spacing w:before="120" w:after="280" w:line="324" w:lineRule="auto"/>
+        <w:ind w:left="255" w:right="198"/>
+        <w:shd w:val="clear" w:color="auto" w:fill="F3ECDA"/>
+        <w:pBdr>
+          <w:left w:val="single" w:sz="18" w:space="8" w:color="007A8C"/>
+        </w:pBdr>
+      </w:pPr>
+      <w:r>
+        <w:rPr>
+          <w:rFonts w:ascii="Segoe UI" w:hAnsi="Segoe UI" w:cs="Segoe UI" w:eastAsia="Segoe UI"/>
           <w:b/>
           <w:bCs/>
+          <w:color w:val="0A192F"/>
+          <w:sz w:val="26"/>
         </w:rPr>
         <w:t xml:space="preserve">Question </w:t>
       </w:r>
       <w:r>
         <w:rPr>
+          <w:rFonts w:ascii="Segoe UI" w:hAnsi="Segoe UI" w:cs="Segoe UI" w:eastAsia="Segoe UI"/>
           <w:b/>
           <w:bCs/>
+          <w:color w:val="0A192F"/>
+          <w:sz w:val="26"/>
         </w:rPr>
         <w:t>:</w:t>
       </w:r>
       <w:r>
+        <w:rPr>
+          <w:rFonts w:ascii="Segoe UI" w:hAnsi="Segoe UI" w:cs="Segoe UI" w:eastAsia="Segoe UI"/>
+          <w:b w:val="0"/>
+          <w:color w:val="0A192F"/>
+          <w:sz w:val="26"/>
+        </w:rPr>
         <w:br/>
       </w:r>
       <w:r>
         <w:rPr>
+          <w:rFonts w:ascii="Segoe UI" w:hAnsi="Segoe UI" w:cs="Segoe UI" w:eastAsia="Segoe UI"/>
+          <w:b w:val="0"/>
           <w:i/>
           <w:iCs/>
+          <w:color w:val="0A192F"/>
+          <w:sz w:val="26"/>
         </w:rPr>
         <w:t>Le changement de langue vous a-t-il paru clair et complet ? Y a-t-il des endroits où le texte restait dans l’autre langue, ou où le ton vous a semblé étrange ?</w:t>
       </w:r>
     </w:p>
     <w:p>
+      <w:pPr>
+        <w:spacing w:before="0" w:after="40" w:line="240" w:lineRule="auto"/>
+        <w:ind w:left="0" w:right="0"/>
+      </w:pPr>
       <w:r>
         <w:lastRenderedPageBreak/>
         <w:pict w14:anchorId="0F3197D2">
@@ -302,58 +530,103 @@
     <w:p>
       <w:pPr>
         <w:pStyle w:val="Titre3"/>
+        <w:spacing w:before="320" w:after="120" w:line="288" w:lineRule="auto"/>
+        <w:ind w:left="0" w:right="0"/>
       </w:pPr>
       <w:bookmarkStart w:id="6" w:name="étape-3-recherche-depuis-laccueil"/>
       <w:bookmarkEnd w:id="5"/>
       <w:r>
+        <w:rPr>
+          <w:rFonts w:ascii="Segoe UI" w:hAnsi="Segoe UI" w:cs="Segoe UI" w:eastAsia="Segoe UI"/>
+          <w:b/>
+          <w:color w:val="007A8C"/>
+          <w:sz w:val="30"/>
+        </w:rPr>
         <w:t>Étape 3 — Recherche depuis l’accueil</w:t>
       </w:r>
     </w:p>
     <w:p>
       <w:pPr>
         <w:pStyle w:val="FirstParagraph"/>
-      </w:pPr>
-      <w:r>
-        <w:rPr>
+        <w:spacing w:before="40" w:after="160" w:line="324" w:lineRule="auto"/>
+        <w:ind w:left="0" w:right="0"/>
+      </w:pPr>
+      <w:r>
+        <w:rPr>
+          <w:rFonts w:ascii="Segoe UI" w:hAnsi="Segoe UI" w:cs="Segoe UI" w:eastAsia="Segoe UI"/>
           <w:b/>
           <w:bCs/>
+          <w:color w:val="0A192F"/>
+          <w:sz w:val="26"/>
         </w:rPr>
         <w:t>À faire</w:t>
       </w:r>
       <w:r>
+        <w:rPr>
+          <w:rFonts w:ascii="Segoe UI" w:hAnsi="Segoe UI" w:cs="Segoe UI" w:eastAsia="Segoe UI"/>
+          <w:b w:val="0"/>
+          <w:color w:val="0A192F"/>
+          <w:sz w:val="26"/>
+        </w:rPr>
         <w:t xml:space="preserve"> - Sur l’accueil, saisir un mot ou un thème qui vous intéresse (ex. environnement, santé, droit…). - Lancer la recherche. - Observer la page de résultats.</w:t>
       </w:r>
     </w:p>
     <w:p>
       <w:pPr>
         <w:pStyle w:val="Corpsdetexte"/>
-      </w:pPr>
-      <w:r>
-        <w:rPr>
+        <w:spacing w:before="120" w:after="280" w:line="324" w:lineRule="auto"/>
+        <w:ind w:left="255" w:right="198"/>
+        <w:shd w:val="clear" w:color="auto" w:fill="F3ECDA"/>
+        <w:pBdr>
+          <w:left w:val="single" w:sz="18" w:space="8" w:color="007A8C"/>
+        </w:pBdr>
+      </w:pPr>
+      <w:r>
+        <w:rPr>
+          <w:rFonts w:ascii="Segoe UI" w:hAnsi="Segoe UI" w:cs="Segoe UI" w:eastAsia="Segoe UI"/>
           <w:b/>
           <w:bCs/>
+          <w:color w:val="0A192F"/>
+          <w:sz w:val="26"/>
         </w:rPr>
         <w:t xml:space="preserve">Question </w:t>
       </w:r>
       <w:r>
         <w:rPr>
+          <w:rFonts w:ascii="Segoe UI" w:hAnsi="Segoe UI" w:cs="Segoe UI" w:eastAsia="Segoe UI"/>
           <w:b/>
           <w:bCs/>
+          <w:color w:val="0A192F"/>
+          <w:sz w:val="26"/>
         </w:rPr>
         <w:t>:</w:t>
       </w:r>
       <w:r>
+        <w:rPr>
+          <w:rFonts w:ascii="Segoe UI" w:hAnsi="Segoe UI" w:cs="Segoe UI" w:eastAsia="Segoe UI"/>
+          <w:b w:val="0"/>
+          <w:color w:val="0A192F"/>
+          <w:sz w:val="26"/>
+        </w:rPr>
         <w:br/>
       </w:r>
       <w:r>
         <w:rPr>
+          <w:rFonts w:ascii="Segoe UI" w:hAnsi="Segoe UI" w:cs="Segoe UI" w:eastAsia="Segoe UI"/>
+          <w:b w:val="0"/>
           <w:i/>
           <w:iCs/>
+          <w:color w:val="0A192F"/>
+          <w:sz w:val="26"/>
         </w:rPr>
         <w:t>Les résultats correspondent-ils à ce que vous attendiez ? Qu’auriez-vous aimé pouvoir préciser (filtres, type de document, date…) ?</w:t>
       </w:r>
     </w:p>
     <w:p>
+      <w:pPr>
+        <w:spacing w:before="0" w:after="40" w:line="240" w:lineRule="auto"/>
+        <w:ind w:left="0" w:right="0"/>
+      </w:pPr>
       <w:r>
         <w:pict w14:anchorId="7C9A0ABC">
           <v:rect id="_x0000_i1029" style="width:0;height:1.5pt" o:hralign="center" o:hrstd="t" o:hr="t"/>
@@ -363,68 +636,122 @@
     <w:p>
       <w:pPr>
         <w:pStyle w:val="Titre3"/>
+        <w:spacing w:before="320" w:after="120" w:line="288" w:lineRule="auto"/>
+        <w:ind w:left="0" w:right="0"/>
       </w:pPr>
       <w:bookmarkStart w:id="7" w:name="étape-4-navigation-par-domaines"/>
       <w:bookmarkEnd w:id="6"/>
       <w:r>
+        <w:rPr>
+          <w:rFonts w:ascii="Segoe UI" w:hAnsi="Segoe UI" w:cs="Segoe UI" w:eastAsia="Segoe UI"/>
+          <w:b/>
+          <w:color w:val="007A8C"/>
+          <w:sz w:val="30"/>
+        </w:rPr>
         <w:t>Étape 4 — Navigation par domaines</w:t>
       </w:r>
     </w:p>
     <w:p>
       <w:pPr>
         <w:pStyle w:val="FirstParagraph"/>
-      </w:pPr>
-      <w:r>
-        <w:rPr>
+        <w:spacing w:before="40" w:after="160" w:line="324" w:lineRule="auto"/>
+        <w:ind w:left="0" w:right="0"/>
+      </w:pPr>
+      <w:r>
+        <w:rPr>
+          <w:rFonts w:ascii="Segoe UI" w:hAnsi="Segoe UI" w:cs="Segoe UI" w:eastAsia="Segoe UI"/>
           <w:b/>
           <w:bCs/>
+          <w:color w:val="0A192F"/>
+          <w:sz w:val="26"/>
         </w:rPr>
         <w:t>À faire</w:t>
       </w:r>
       <w:r>
+        <w:rPr>
+          <w:rFonts w:ascii="Segoe UI" w:hAnsi="Segoe UI" w:cs="Segoe UI" w:eastAsia="Segoe UI"/>
+          <w:b w:val="0"/>
+          <w:color w:val="0A192F"/>
+          <w:sz w:val="26"/>
+        </w:rPr>
         <w:t xml:space="preserve"> - Depuis l’accueil, explorer le carrousel / les domaines scientifiques (ou aller dans « Catégories » / domaines). - Ouvrir </w:t>
       </w:r>
       <w:r>
         <w:rPr>
+          <w:rFonts w:ascii="Segoe UI" w:hAnsi="Segoe UI" w:cs="Segoe UI" w:eastAsia="Segoe UI"/>
           <w:b/>
           <w:bCs/>
+          <w:color w:val="0A192F"/>
+          <w:sz w:val="26"/>
         </w:rPr>
         <w:t>un domaine</w:t>
       </w:r>
       <w:r>
+        <w:rPr>
+          <w:rFonts w:ascii="Segoe UI" w:hAnsi="Segoe UI" w:cs="Segoe UI" w:eastAsia="Segoe UI"/>
+          <w:b w:val="0"/>
+          <w:color w:val="0A192F"/>
+          <w:sz w:val="26"/>
+        </w:rPr>
         <w:t xml:space="preserve"> qui vous attire. - Lire le texte d’introduction du domaine, puis regarder la liste de publications.</w:t>
       </w:r>
     </w:p>
     <w:p>
       <w:pPr>
         <w:pStyle w:val="Corpsdetexte"/>
-      </w:pPr>
-      <w:r>
-        <w:rPr>
+        <w:spacing w:before="120" w:after="280" w:line="324" w:lineRule="auto"/>
+        <w:ind w:left="255" w:right="198"/>
+        <w:shd w:val="clear" w:color="auto" w:fill="F3ECDA"/>
+        <w:pBdr>
+          <w:left w:val="single" w:sz="18" w:space="8" w:color="007A8C"/>
+        </w:pBdr>
+      </w:pPr>
+      <w:r>
+        <w:rPr>
+          <w:rFonts w:ascii="Segoe UI" w:hAnsi="Segoe UI" w:cs="Segoe UI" w:eastAsia="Segoe UI"/>
           <w:b/>
           <w:bCs/>
+          <w:color w:val="0A192F"/>
+          <w:sz w:val="26"/>
         </w:rPr>
         <w:t xml:space="preserve">Question </w:t>
       </w:r>
       <w:r>
         <w:rPr>
+          <w:rFonts w:ascii="Segoe UI" w:hAnsi="Segoe UI" w:cs="Segoe UI" w:eastAsia="Segoe UI"/>
           <w:b/>
           <w:bCs/>
+          <w:color w:val="0A192F"/>
+          <w:sz w:val="26"/>
         </w:rPr>
         <w:t>:</w:t>
       </w:r>
       <w:r>
+        <w:rPr>
+          <w:rFonts w:ascii="Segoe UI" w:hAnsi="Segoe UI" w:cs="Segoe UI" w:eastAsia="Segoe UI"/>
+          <w:b w:val="0"/>
+          <w:color w:val="0A192F"/>
+          <w:sz w:val="26"/>
+        </w:rPr>
         <w:br/>
       </w:r>
       <w:r>
         <w:rPr>
+          <w:rFonts w:ascii="Segoe UI" w:hAnsi="Segoe UI" w:cs="Segoe UI" w:eastAsia="Segoe UI"/>
+          <w:b w:val="0"/>
           <w:i/>
           <w:iCs/>
+          <w:color w:val="0A192F"/>
+          <w:sz w:val="26"/>
         </w:rPr>
         <w:t>Le découpage par domaines vous aide-t-il à vous orienter ? Le texte du domaine choisi était-il compréhensible pour quelqu’un qui n’est pas chercheur ?</w:t>
       </w:r>
     </w:p>
     <w:p>
+      <w:pPr>
+        <w:spacing w:before="0" w:after="40" w:line="240" w:lineRule="auto"/>
+        <w:ind w:left="0" w:right="0"/>
+      </w:pPr>
       <w:r>
         <w:pict w14:anchorId="3C9AB805">
           <v:rect id="_x0000_i1030" style="width:0;height:1.5pt" o:hralign="center" o:hrstd="t" o:hr="t"/>
@@ -434,58 +761,103 @@
     <w:p>
       <w:pPr>
         <w:pStyle w:val="Titre3"/>
+        <w:spacing w:before="320" w:after="120" w:line="288" w:lineRule="auto"/>
+        <w:ind w:left="0" w:right="0"/>
       </w:pPr>
       <w:bookmarkStart w:id="8" w:name="étape-5-liste-des-publications"/>
       <w:bookmarkEnd w:id="7"/>
       <w:r>
+        <w:rPr>
+          <w:rFonts w:ascii="Segoe UI" w:hAnsi="Segoe UI" w:cs="Segoe UI" w:eastAsia="Segoe UI"/>
+          <w:b/>
+          <w:color w:val="007A8C"/>
+          <w:sz w:val="30"/>
+        </w:rPr>
         <w:t>Étape 5 — Liste des publications</w:t>
       </w:r>
     </w:p>
     <w:p>
       <w:pPr>
         <w:pStyle w:val="FirstParagraph"/>
-      </w:pPr>
-      <w:r>
-        <w:rPr>
+        <w:spacing w:before="40" w:after="160" w:line="324" w:lineRule="auto"/>
+        <w:ind w:left="0" w:right="0"/>
+      </w:pPr>
+      <w:r>
+        <w:rPr>
+          <w:rFonts w:ascii="Segoe UI" w:hAnsi="Segoe UI" w:cs="Segoe UI" w:eastAsia="Segoe UI"/>
           <w:b/>
           <w:bCs/>
+          <w:color w:val="0A192F"/>
+          <w:sz w:val="26"/>
         </w:rPr>
         <w:t>À faire</w:t>
       </w:r>
       <w:r>
+        <w:rPr>
+          <w:rFonts w:ascii="Segoe UI" w:hAnsi="Segoe UI" w:cs="Segoe UI" w:eastAsia="Segoe UI"/>
+          <w:b w:val="0"/>
+          <w:color w:val="0A192F"/>
+          <w:sz w:val="26"/>
+        </w:rPr>
         <w:t xml:space="preserve"> - Sur une page domaine ou sur la page Recherche, regarder plusieurs cartes / résultats. - Noter ce qui apparaît (titre, résumé, image, auteur…).</w:t>
       </w:r>
     </w:p>
     <w:p>
       <w:pPr>
         <w:pStyle w:val="Corpsdetexte"/>
-      </w:pPr>
-      <w:r>
-        <w:rPr>
+        <w:spacing w:before="120" w:after="280" w:line="324" w:lineRule="auto"/>
+        <w:ind w:left="255" w:right="198"/>
+        <w:shd w:val="clear" w:color="auto" w:fill="F3ECDA"/>
+        <w:pBdr>
+          <w:left w:val="single" w:sz="18" w:space="8" w:color="007A8C"/>
+        </w:pBdr>
+      </w:pPr>
+      <w:r>
+        <w:rPr>
+          <w:rFonts w:ascii="Segoe UI" w:hAnsi="Segoe UI" w:cs="Segoe UI" w:eastAsia="Segoe UI"/>
           <w:b/>
           <w:bCs/>
+          <w:color w:val="0A192F"/>
+          <w:sz w:val="26"/>
         </w:rPr>
         <w:t xml:space="preserve">Question </w:t>
       </w:r>
       <w:r>
         <w:rPr>
+          <w:rFonts w:ascii="Segoe UI" w:hAnsi="Segoe UI" w:cs="Segoe UI" w:eastAsia="Segoe UI"/>
           <w:b/>
           <w:bCs/>
+          <w:color w:val="0A192F"/>
+          <w:sz w:val="26"/>
         </w:rPr>
         <w:t>:</w:t>
       </w:r>
       <w:r>
+        <w:rPr>
+          <w:rFonts w:ascii="Segoe UI" w:hAnsi="Segoe UI" w:cs="Segoe UI" w:eastAsia="Segoe UI"/>
+          <w:b w:val="0"/>
+          <w:color w:val="0A192F"/>
+          <w:sz w:val="26"/>
+        </w:rPr>
         <w:br/>
       </w:r>
       <w:r>
         <w:rPr>
+          <w:rFonts w:ascii="Segoe UI" w:hAnsi="Segoe UI" w:cs="Segoe UI" w:eastAsia="Segoe UI"/>
+          <w:b w:val="0"/>
           <w:i/>
           <w:iCs/>
+          <w:color w:val="0A192F"/>
+          <w:sz w:val="26"/>
         </w:rPr>
         <w:t>Sur une carte de publication, quelles informations vous aident vraiment à décider d’ouvrir ou non ? Qu’est-ce qui manque ou vous paraît superflu ?</w:t>
       </w:r>
     </w:p>
     <w:p>
+      <w:pPr>
+        <w:spacing w:before="0" w:after="40" w:line="240" w:lineRule="auto"/>
+        <w:ind w:left="0" w:right="0"/>
+      </w:pPr>
       <w:r>
         <w:pict w14:anchorId="16927D0C">
           <v:rect id="_x0000_i1031" style="width:0;height:1.5pt" o:hralign="center" o:hrstd="t" o:hr="t"/>
@@ -495,68 +867,122 @@
     <w:p>
       <w:pPr>
         <w:pStyle w:val="Titre3"/>
+        <w:spacing w:before="320" w:after="120" w:line="288" w:lineRule="auto"/>
+        <w:ind w:left="0" w:right="0"/>
       </w:pPr>
       <w:bookmarkStart w:id="9" w:name="étape-6-fiche-dune-publication"/>
       <w:bookmarkEnd w:id="8"/>
       <w:r>
+        <w:rPr>
+          <w:rFonts w:ascii="Segoe UI" w:hAnsi="Segoe UI" w:cs="Segoe UI" w:eastAsia="Segoe UI"/>
+          <w:b/>
+          <w:color w:val="007A8C"/>
+          <w:sz w:val="30"/>
+        </w:rPr>
         <w:t>Étape 6 — Fiche d’une publication</w:t>
       </w:r>
     </w:p>
     <w:p>
       <w:pPr>
         <w:pStyle w:val="FirstParagraph"/>
-      </w:pPr>
-      <w:r>
-        <w:rPr>
+        <w:spacing w:before="40" w:after="160" w:line="324" w:lineRule="auto"/>
+        <w:ind w:left="0" w:right="0"/>
+      </w:pPr>
+      <w:r>
+        <w:rPr>
+          <w:rFonts w:ascii="Segoe UI" w:hAnsi="Segoe UI" w:cs="Segoe UI" w:eastAsia="Segoe UI"/>
           <w:b/>
           <w:bCs/>
+          <w:color w:val="0A192F"/>
+          <w:sz w:val="26"/>
         </w:rPr>
         <w:t>À faire</w:t>
       </w:r>
       <w:r>
+        <w:rPr>
+          <w:rFonts w:ascii="Segoe UI" w:hAnsi="Segoe UI" w:cs="Segoe UI" w:eastAsia="Segoe UI"/>
+          <w:b w:val="0"/>
+          <w:color w:val="0A192F"/>
+          <w:sz w:val="26"/>
+        </w:rPr>
         <w:t xml:space="preserve"> - Ouvrir </w:t>
       </w:r>
       <w:r>
         <w:rPr>
+          <w:rFonts w:ascii="Segoe UI" w:hAnsi="Segoe UI" w:cs="Segoe UI" w:eastAsia="Segoe UI"/>
           <w:b/>
           <w:bCs/>
+          <w:color w:val="0A192F"/>
+          <w:sz w:val="26"/>
         </w:rPr>
         <w:t>une</w:t>
       </w:r>
       <w:r>
+        <w:rPr>
+          <w:rFonts w:ascii="Segoe UI" w:hAnsi="Segoe UI" w:cs="Segoe UI" w:eastAsia="Segoe UI"/>
+          <w:b w:val="0"/>
+          <w:color w:val="0A192F"/>
+          <w:sz w:val="26"/>
+        </w:rPr>
         <w:t xml:space="preserve"> publication. - Lire le titre, le résumé / texte accessible, les infos affichées. - Si un bouton permet d’ouvrir le document (PDF), cliquez dessus.</w:t>
       </w:r>
     </w:p>
     <w:p>
       <w:pPr>
         <w:pStyle w:val="Corpsdetexte"/>
-      </w:pPr>
-      <w:r>
-        <w:rPr>
+        <w:spacing w:before="120" w:after="280" w:line="324" w:lineRule="auto"/>
+        <w:ind w:left="255" w:right="198"/>
+        <w:shd w:val="clear" w:color="auto" w:fill="F3ECDA"/>
+        <w:pBdr>
+          <w:left w:val="single" w:sz="18" w:space="8" w:color="007A8C"/>
+        </w:pBdr>
+      </w:pPr>
+      <w:r>
+        <w:rPr>
+          <w:rFonts w:ascii="Segoe UI" w:hAnsi="Segoe UI" w:cs="Segoe UI" w:eastAsia="Segoe UI"/>
           <w:b/>
           <w:bCs/>
+          <w:color w:val="0A192F"/>
+          <w:sz w:val="26"/>
         </w:rPr>
         <w:t xml:space="preserve">Question </w:t>
       </w:r>
       <w:r>
         <w:rPr>
+          <w:rFonts w:ascii="Segoe UI" w:hAnsi="Segoe UI" w:cs="Segoe UI" w:eastAsia="Segoe UI"/>
           <w:b/>
           <w:bCs/>
+          <w:color w:val="0A192F"/>
+          <w:sz w:val="26"/>
         </w:rPr>
         <w:t>:</w:t>
       </w:r>
       <w:r>
+        <w:rPr>
+          <w:rFonts w:ascii="Segoe UI" w:hAnsi="Segoe UI" w:cs="Segoe UI" w:eastAsia="Segoe UI"/>
+          <w:b w:val="0"/>
+          <w:color w:val="0A192F"/>
+          <w:sz w:val="26"/>
+        </w:rPr>
         <w:br/>
       </w:r>
       <w:r>
         <w:rPr>
+          <w:rFonts w:ascii="Segoe UI" w:hAnsi="Segoe UI" w:cs="Segoe UI" w:eastAsia="Segoe UI"/>
+          <w:b w:val="0"/>
           <w:i/>
           <w:iCs/>
+          <w:color w:val="0A192F"/>
+          <w:sz w:val="26"/>
         </w:rPr>
         <w:t>Après avoir lu la fiche, avez-vous compris de quoi parle ce travail, pour qui il est utile, et d’où vient le document ? Qu’est-ce qui vous a freiné ?</w:t>
       </w:r>
     </w:p>
     <w:p>
+      <w:pPr>
+        <w:spacing w:before="0" w:after="40" w:line="240" w:lineRule="auto"/>
+        <w:ind w:left="0" w:right="0"/>
+      </w:pPr>
       <w:r>
         <w:pict w14:anchorId="0CD3F80D">
           <v:rect id="_x0000_i1032" style="width:0;height:1.5pt" o:hralign="center" o:hrstd="t" o:hr="t"/>
@@ -566,10 +992,18 @@
     <w:p>
       <w:pPr>
         <w:pStyle w:val="Titre3"/>
+        <w:spacing w:before="320" w:after="120" w:line="288" w:lineRule="auto"/>
+        <w:ind w:left="0" w:right="0"/>
       </w:pPr>
       <w:bookmarkStart w:id="10" w:name="étape-7-document-pdf-source"/>
       <w:bookmarkEnd w:id="9"/>
       <w:r>
+        <w:rPr>
+          <w:rFonts w:ascii="Segoe UI" w:hAnsi="Segoe UI" w:cs="Segoe UI" w:eastAsia="Segoe UI"/>
+          <w:b/>
+          <w:color w:val="007A8C"/>
+          <w:sz w:val="30"/>
+        </w:rPr>
         <w:lastRenderedPageBreak/>
         <w:t>Étape 7 — Document PDF / source</w:t>
       </w:r>
@@ -577,48 +1011,85 @@
     <w:p>
       <w:pPr>
         <w:pStyle w:val="FirstParagraph"/>
-      </w:pPr>
-      <w:r>
-        <w:rPr>
+        <w:spacing w:before="40" w:after="160" w:line="324" w:lineRule="auto"/>
+        <w:ind w:left="0" w:right="0"/>
+      </w:pPr>
+      <w:r>
+        <w:rPr>
+          <w:rFonts w:ascii="Segoe UI" w:hAnsi="Segoe UI" w:cs="Segoe UI" w:eastAsia="Segoe UI"/>
           <w:b/>
           <w:bCs/>
+          <w:color w:val="0A192F"/>
+          <w:sz w:val="26"/>
         </w:rPr>
         <w:t>À faire</w:t>
       </w:r>
       <w:r>
+        <w:rPr>
+          <w:rFonts w:ascii="Segoe UI" w:hAnsi="Segoe UI" w:cs="Segoe UI" w:eastAsia="Segoe UI"/>
+          <w:b w:val="0"/>
+          <w:color w:val="0A192F"/>
+          <w:sz w:val="26"/>
+        </w:rPr>
         <w:t xml:space="preserve"> - Depuis une fiche qui propose un document, ouvrir le PDF (ou le lien source). - Revenir ensuite sur le site.</w:t>
       </w:r>
     </w:p>
     <w:p>
       <w:pPr>
         <w:pStyle w:val="Corpsdetexte"/>
-      </w:pPr>
-      <w:r>
-        <w:rPr>
+        <w:spacing w:before="120" w:after="280" w:line="324" w:lineRule="auto"/>
+        <w:ind w:left="255" w:right="198"/>
+        <w:shd w:val="clear" w:color="auto" w:fill="F3ECDA"/>
+        <w:pBdr>
+          <w:left w:val="single" w:sz="18" w:space="8" w:color="007A8C"/>
+        </w:pBdr>
+      </w:pPr>
+      <w:r>
+        <w:rPr>
+          <w:rFonts w:ascii="Segoe UI" w:hAnsi="Segoe UI" w:cs="Segoe UI" w:eastAsia="Segoe UI"/>
           <w:b/>
           <w:bCs/>
+          <w:color w:val="0A192F"/>
+          <w:sz w:val="26"/>
         </w:rPr>
         <w:t xml:space="preserve">Question </w:t>
       </w:r>
       <w:r>
         <w:rPr>
+          <w:rFonts w:ascii="Segoe UI" w:hAnsi="Segoe UI" w:cs="Segoe UI" w:eastAsia="Segoe UI"/>
           <w:b/>
           <w:bCs/>
+          <w:color w:val="0A192F"/>
+          <w:sz w:val="26"/>
         </w:rPr>
         <w:t>:</w:t>
       </w:r>
       <w:r>
+        <w:rPr>
+          <w:rFonts w:ascii="Segoe UI" w:hAnsi="Segoe UI" w:cs="Segoe UI" w:eastAsia="Segoe UI"/>
+          <w:b w:val="0"/>
+          <w:color w:val="0A192F"/>
+          <w:sz w:val="26"/>
+        </w:rPr>
         <w:br/>
       </w:r>
       <w:r>
         <w:rPr>
+          <w:rFonts w:ascii="Segoe UI" w:hAnsi="Segoe UI" w:cs="Segoe UI" w:eastAsia="Segoe UI"/>
+          <w:b w:val="0"/>
           <w:i/>
           <w:iCs/>
+          <w:color w:val="0A192F"/>
+          <w:sz w:val="26"/>
         </w:rPr>
         <w:t>Le passage de la fiche vers le PDF (et le retour) était-il fluide ? Le PDF vous a-t-il semblé cohérent avec ce que la fiche promettait ?</w:t>
       </w:r>
     </w:p>
     <w:p>
+      <w:pPr>
+        <w:spacing w:before="0" w:after="40" w:line="240" w:lineRule="auto"/>
+        <w:ind w:left="0" w:right="0"/>
+      </w:pPr>
       <w:r>
         <w:pict w14:anchorId="3ADFB129">
           <v:rect id="_x0000_i1033" style="width:0;height:1.5pt" o:hralign="center" o:hrstd="t" o:hr="t"/>
@@ -628,58 +1099,103 @@
     <w:p>
       <w:pPr>
         <w:pStyle w:val="Titre3"/>
+        <w:spacing w:before="320" w:after="120" w:line="288" w:lineRule="auto"/>
+        <w:ind w:left="0" w:right="0"/>
       </w:pPr>
       <w:bookmarkStart w:id="11" w:name="Xa8589a3cbc895de2896316dbe03af82e4c3b84f"/>
       <w:bookmarkEnd w:id="10"/>
       <w:r>
+        <w:rPr>
+          <w:rFonts w:ascii="Segoe UI" w:hAnsi="Segoe UI" w:cs="Segoe UI" w:eastAsia="Segoe UI"/>
+          <w:b/>
+          <w:color w:val="007A8C"/>
+          <w:sz w:val="30"/>
+        </w:rPr>
         <w:t>Étape 8 — Recherche UNC (équipes et laboratoires)</w:t>
       </w:r>
     </w:p>
     <w:p>
       <w:pPr>
         <w:pStyle w:val="FirstParagraph"/>
-      </w:pPr>
-      <w:r>
-        <w:rPr>
+        <w:spacing w:before="40" w:after="160" w:line="324" w:lineRule="auto"/>
+        <w:ind w:left="0" w:right="0"/>
+      </w:pPr>
+      <w:r>
+        <w:rPr>
+          <w:rFonts w:ascii="Segoe UI" w:hAnsi="Segoe UI" w:cs="Segoe UI" w:eastAsia="Segoe UI"/>
           <w:b/>
           <w:bCs/>
+          <w:color w:val="0A192F"/>
+          <w:sz w:val="26"/>
         </w:rPr>
         <w:t>À faire</w:t>
       </w:r>
       <w:r>
+        <w:rPr>
+          <w:rFonts w:ascii="Segoe UI" w:hAnsi="Segoe UI" w:cs="Segoe UI" w:eastAsia="Segoe UI"/>
+          <w:b w:val="0"/>
+          <w:color w:val="0A192F"/>
+          <w:sz w:val="26"/>
+        </w:rPr>
         <w:t xml:space="preserve"> - Aller dans « Recherche UNC » / « Chercheurs » (selon le libellé du menu). - Lire la page : équipes, liens, annuaire.</w:t>
       </w:r>
     </w:p>
     <w:p>
       <w:pPr>
         <w:pStyle w:val="Corpsdetexte"/>
-      </w:pPr>
-      <w:r>
-        <w:rPr>
+        <w:spacing w:before="120" w:after="280" w:line="324" w:lineRule="auto"/>
+        <w:ind w:left="255" w:right="198"/>
+        <w:shd w:val="clear" w:color="auto" w:fill="F3ECDA"/>
+        <w:pBdr>
+          <w:left w:val="single" w:sz="18" w:space="8" w:color="007A8C"/>
+        </w:pBdr>
+      </w:pPr>
+      <w:r>
+        <w:rPr>
+          <w:rFonts w:ascii="Segoe UI" w:hAnsi="Segoe UI" w:cs="Segoe UI" w:eastAsia="Segoe UI"/>
           <w:b/>
           <w:bCs/>
+          <w:color w:val="0A192F"/>
+          <w:sz w:val="26"/>
         </w:rPr>
         <w:t xml:space="preserve">Question </w:t>
       </w:r>
       <w:r>
         <w:rPr>
+          <w:rFonts w:ascii="Segoe UI" w:hAnsi="Segoe UI" w:cs="Segoe UI" w:eastAsia="Segoe UI"/>
           <w:b/>
           <w:bCs/>
+          <w:color w:val="0A192F"/>
+          <w:sz w:val="26"/>
         </w:rPr>
         <w:t>:</w:t>
       </w:r>
       <w:r>
+        <w:rPr>
+          <w:rFonts w:ascii="Segoe UI" w:hAnsi="Segoe UI" w:cs="Segoe UI" w:eastAsia="Segoe UI"/>
+          <w:b w:val="0"/>
+          <w:color w:val="0A192F"/>
+          <w:sz w:val="26"/>
+        </w:rPr>
         <w:br/>
       </w:r>
       <w:r>
         <w:rPr>
+          <w:rFonts w:ascii="Segoe UI" w:hAnsi="Segoe UI" w:cs="Segoe UI" w:eastAsia="Segoe UI"/>
+          <w:b w:val="0"/>
           <w:i/>
           <w:iCs/>
+          <w:color w:val="0A192F"/>
+          <w:sz w:val="26"/>
         </w:rPr>
         <w:t>Cette page vous aide-t-elle à comprendre qui fait de la recherche à l’UNC ? Qu’attendriez-vous de plus en tant que visiteur (contacts, sujets, publications liées…) ?</w:t>
       </w:r>
     </w:p>
     <w:p>
+      <w:pPr>
+        <w:spacing w:before="0" w:after="40" w:line="240" w:lineRule="auto"/>
+        <w:ind w:left="0" w:right="0"/>
+      </w:pPr>
       <w:r>
         <w:pict w14:anchorId="329C52B4">
           <v:rect id="_x0000_i1034" style="width:0;height:1.5pt" o:hralign="center" o:hrstd="t" o:hr="t"/>
@@ -689,77 +1205,136 @@
     <w:p>
       <w:pPr>
         <w:pStyle w:val="Titre3"/>
+        <w:spacing w:before="320" w:after="120" w:line="288" w:lineRule="auto"/>
+        <w:ind w:left="0" w:right="0"/>
       </w:pPr>
       <w:bookmarkStart w:id="12" w:name="étape-9-à-propos-et-pages-dinformation"/>
       <w:bookmarkEnd w:id="11"/>
       <w:r>
+        <w:rPr>
+          <w:rFonts w:ascii="Segoe UI" w:hAnsi="Segoe UI" w:cs="Segoe UI" w:eastAsia="Segoe UI"/>
+          <w:b/>
+          <w:color w:val="007A8C"/>
+          <w:sz w:val="30"/>
+        </w:rPr>
         <w:t>Étape 9 — À propos et pages d’information</w:t>
       </w:r>
     </w:p>
     <w:p>
       <w:pPr>
         <w:pStyle w:val="FirstParagraph"/>
-      </w:pPr>
-      <w:r>
-        <w:rPr>
+        <w:spacing w:before="40" w:after="160" w:line="324" w:lineRule="auto"/>
+        <w:ind w:left="0" w:right="0"/>
+      </w:pPr>
+      <w:r>
+        <w:rPr>
+          <w:rFonts w:ascii="Segoe UI" w:hAnsi="Segoe UI" w:cs="Segoe UI" w:eastAsia="Segoe UI"/>
           <w:b/>
           <w:bCs/>
+          <w:color w:val="0A192F"/>
+          <w:sz w:val="26"/>
         </w:rPr>
         <w:t>À faire</w:t>
       </w:r>
       <w:r>
+        <w:rPr>
+          <w:rFonts w:ascii="Segoe UI" w:hAnsi="Segoe UI" w:cs="Segoe UI" w:eastAsia="Segoe UI"/>
+          <w:b w:val="0"/>
+          <w:color w:val="0A192F"/>
+          <w:sz w:val="26"/>
+        </w:rPr>
         <w:t xml:space="preserve"> - Ouvrir « À propos ». - Ouvrir au moins une page du pied de page : Mentions légales, Confidentialité ou Cookies.</w:t>
       </w:r>
     </w:p>
     <w:p>
       <w:pPr>
         <w:pStyle w:val="Corpsdetexte"/>
-      </w:pPr>
-      <w:r>
-        <w:rPr>
+        <w:spacing w:before="120" w:after="280" w:line="324" w:lineRule="auto"/>
+        <w:ind w:left="255" w:right="198"/>
+        <w:shd w:val="clear" w:color="auto" w:fill="F3ECDA"/>
+        <w:pBdr>
+          <w:left w:val="single" w:sz="18" w:space="8" w:color="007A8C"/>
+        </w:pBdr>
+      </w:pPr>
+      <w:r>
+        <w:rPr>
+          <w:rFonts w:ascii="Segoe UI" w:hAnsi="Segoe UI" w:cs="Segoe UI" w:eastAsia="Segoe UI"/>
           <w:b/>
           <w:bCs/>
+          <w:color w:val="0A192F"/>
+          <w:sz w:val="26"/>
         </w:rPr>
         <w:t>Question</w:t>
       </w:r>
       <w:r>
         <w:rPr>
+          <w:rFonts w:ascii="Segoe UI" w:hAnsi="Segoe UI" w:cs="Segoe UI" w:eastAsia="Segoe UI"/>
           <w:b/>
           <w:bCs/>
+          <w:color w:val="0A192F"/>
+          <w:sz w:val="26"/>
         </w:rPr>
         <w:t xml:space="preserve"> :</w:t>
       </w:r>
       <w:r>
+        <w:rPr>
+          <w:rFonts w:ascii="Segoe UI" w:hAnsi="Segoe UI" w:cs="Segoe UI" w:eastAsia="Segoe UI"/>
+          <w:b w:val="0"/>
+          <w:color w:val="0A192F"/>
+          <w:sz w:val="26"/>
+        </w:rPr>
         <w:t xml:space="preserve"> </w:t>
       </w:r>
       <w:r>
+        <w:rPr>
+          <w:rFonts w:ascii="Segoe UI" w:hAnsi="Segoe UI" w:cs="Segoe UI" w:eastAsia="Segoe UI"/>
+          <w:b w:val="0"/>
+          <w:color w:val="0A192F"/>
+          <w:sz w:val="26"/>
+        </w:rPr>
         <w:br/>
       </w:r>
       <w:r>
         <w:rPr>
+          <w:rFonts w:ascii="Segoe UI" w:hAnsi="Segoe UI" w:cs="Segoe UI" w:eastAsia="Segoe UI"/>
+          <w:b w:val="0"/>
           <w:i/>
           <w:iCs/>
+          <w:color w:val="0A192F"/>
+          <w:sz w:val="26"/>
         </w:rPr>
         <w:t xml:space="preserve">Après </w:t>
       </w:r>
       <w:proofErr w:type="spellStart"/>
       <w:r>
         <w:rPr>
+          <w:rFonts w:ascii="Segoe UI" w:hAnsi="Segoe UI" w:cs="Segoe UI" w:eastAsia="Segoe UI"/>
+          <w:b w:val="0"/>
           <w:i/>
           <w:iCs/>
+          <w:color w:val="0A192F"/>
+          <w:sz w:val="26"/>
         </w:rPr>
         <w:t>ces</w:t>
       </w:r>
       <w:proofErr w:type="spellEnd"/>
       <w:r>
         <w:rPr>
+          <w:rFonts w:ascii="Segoe UI" w:hAnsi="Segoe UI" w:cs="Segoe UI" w:eastAsia="Segoe UI"/>
+          <w:b w:val="0"/>
           <w:i/>
           <w:iCs/>
+          <w:color w:val="0A192F"/>
+          <w:sz w:val="26"/>
         </w:rPr>
         <w:t xml:space="preserve"> pages, faites-vous davantage confiance au site ? Qu’est-ce qui manque pour que ce soit rassurant pour un public large ?</w:t>
       </w:r>
     </w:p>
     <w:p>
+      <w:pPr>
+        <w:spacing w:before="0" w:after="40" w:line="240" w:lineRule="auto"/>
+        <w:ind w:left="0" w:right="0"/>
+      </w:pPr>
       <w:r>
         <w:pict w14:anchorId="321D90F1">
           <v:rect id="_x0000_i1035" style="width:0;height:1.5pt" o:hralign="center" o:hrstd="t" o:hr="t"/>
@@ -769,90 +1344,151 @@
     <w:p>
       <w:pPr>
         <w:pStyle w:val="Titre3"/>
+        <w:spacing w:before="320" w:after="120" w:line="288" w:lineRule="auto"/>
+        <w:ind w:left="0" w:right="0"/>
       </w:pPr>
       <w:bookmarkStart w:id="13" w:name="X09f091a120653c948aa5715d7f3e141897c7b23"/>
       <w:bookmarkEnd w:id="12"/>
       <w:r>
+        <w:rPr>
+          <w:rFonts w:ascii="Segoe UI" w:hAnsi="Segoe UI" w:cs="Segoe UI" w:eastAsia="Segoe UI"/>
+          <w:b/>
+          <w:color w:val="007A8C"/>
+          <w:sz w:val="30"/>
+        </w:rPr>
         <w:t>Étape 10 — Navigation générale et mobile (si possible)</w:t>
       </w:r>
     </w:p>
     <w:p>
       <w:pPr>
         <w:pStyle w:val="FirstParagraph"/>
-      </w:pPr>
-      <w:r>
-        <w:rPr>
+        <w:spacing w:before="40" w:after="160" w:line="324" w:lineRule="auto"/>
+        <w:ind w:left="0" w:right="0"/>
+      </w:pPr>
+      <w:r>
+        <w:rPr>
+          <w:rFonts w:ascii="Segoe UI" w:hAnsi="Segoe UI" w:cs="Segoe UI" w:eastAsia="Segoe UI"/>
           <w:b/>
           <w:bCs/>
+          <w:color w:val="0A192F"/>
+          <w:sz w:val="26"/>
         </w:rPr>
         <w:t>À faire</w:t>
       </w:r>
       <w:r>
+        <w:rPr>
+          <w:rFonts w:ascii="Segoe UI" w:hAnsi="Segoe UI" w:cs="Segoe UI" w:eastAsia="Segoe UI"/>
+          <w:b w:val="0"/>
+          <w:color w:val="0A192F"/>
+          <w:sz w:val="26"/>
+        </w:rPr>
         <w:t xml:space="preserve"> - Revenir à l’accueil en utilisant le menu. - Si vous avez un téléphone ou une fenêtre étroite : réduire la fenêtre ou tester sur mobile, puis refaire 2–3 actions simples (accueil → domaine → une publication).</w:t>
       </w:r>
     </w:p>
     <w:p>
       <w:pPr>
         <w:pStyle w:val="Corpsdetexte"/>
-      </w:pPr>
-      <w:r>
-        <w:rPr>
+        <w:spacing w:before="120" w:after="280" w:line="324" w:lineRule="auto"/>
+        <w:ind w:left="255" w:right="198"/>
+        <w:shd w:val="clear" w:color="auto" w:fill="F3ECDA"/>
+        <w:pBdr>
+          <w:left w:val="single" w:sz="18" w:space="8" w:color="007A8C"/>
+        </w:pBdr>
+      </w:pPr>
+      <w:r>
+        <w:rPr>
+          <w:rFonts w:ascii="Segoe UI" w:hAnsi="Segoe UI" w:cs="Segoe UI" w:eastAsia="Segoe UI"/>
           <w:b/>
           <w:bCs/>
+          <w:color w:val="0A192F"/>
+          <w:sz w:val="26"/>
         </w:rPr>
         <w:t>Question</w:t>
       </w:r>
       <w:r>
         <w:rPr>
+          <w:rFonts w:ascii="Segoe UI" w:hAnsi="Segoe UI" w:cs="Segoe UI" w:eastAsia="Segoe UI"/>
           <w:b/>
           <w:bCs/>
+          <w:color w:val="0A192F"/>
+          <w:sz w:val="26"/>
         </w:rPr>
         <w:t xml:space="preserve"> :</w:t>
       </w:r>
       <w:r>
+        <w:rPr>
+          <w:rFonts w:ascii="Segoe UI" w:hAnsi="Segoe UI" w:cs="Segoe UI" w:eastAsia="Segoe UI"/>
+          <w:b w:val="0"/>
+          <w:color w:val="0A192F"/>
+          <w:sz w:val="26"/>
+        </w:rPr>
         <w:br/>
       </w:r>
       <w:r>
         <w:rPr>
+          <w:rFonts w:ascii="Segoe UI" w:hAnsi="Segoe UI" w:cs="Segoe UI" w:eastAsia="Segoe UI"/>
+          <w:b w:val="0"/>
           <w:i/>
           <w:iCs/>
+          <w:color w:val="0A192F"/>
+          <w:sz w:val="26"/>
         </w:rPr>
         <w:t xml:space="preserve">Vous </w:t>
       </w:r>
       <w:proofErr w:type="spellStart"/>
       <w:r>
         <w:rPr>
+          <w:rFonts w:ascii="Segoe UI" w:hAnsi="Segoe UI" w:cs="Segoe UI" w:eastAsia="Segoe UI"/>
+          <w:b w:val="0"/>
           <w:i/>
           <w:iCs/>
+          <w:color w:val="0A192F"/>
+          <w:sz w:val="26"/>
         </w:rPr>
         <w:t>êtes</w:t>
       </w:r>
       <w:proofErr w:type="spellEnd"/>
       <w:r>
         <w:rPr>
+          <w:rFonts w:ascii="Segoe UI" w:hAnsi="Segoe UI" w:cs="Segoe UI" w:eastAsia="Segoe UI"/>
+          <w:b w:val="0"/>
           <w:i/>
           <w:iCs/>
+          <w:color w:val="0A192F"/>
+          <w:sz w:val="26"/>
         </w:rPr>
         <w:t xml:space="preserve">-vous </w:t>
       </w:r>
       <w:proofErr w:type="spellStart"/>
       <w:r>
         <w:rPr>
+          <w:rFonts w:ascii="Segoe UI" w:hAnsi="Segoe UI" w:cs="Segoe UI" w:eastAsia="Segoe UI"/>
+          <w:b w:val="0"/>
           <w:i/>
           <w:iCs/>
+          <w:color w:val="0A192F"/>
+          <w:sz w:val="26"/>
         </w:rPr>
         <w:t>senti·e</w:t>
       </w:r>
       <w:proofErr w:type="spellEnd"/>
       <w:r>
         <w:rPr>
+          <w:rFonts w:ascii="Segoe UI" w:hAnsi="Segoe UI" w:cs="Segoe UI" w:eastAsia="Segoe UI"/>
+          <w:b w:val="0"/>
           <w:i/>
           <w:iCs/>
+          <w:color w:val="0A192F"/>
+          <w:sz w:val="26"/>
         </w:rPr>
         <w:t xml:space="preserve"> perdu·e à un moment ? Sur téléphone (ou petite fenêtre), qu’est-ce qui était plus difficile que sur ordinateur ?</w:t>
       </w:r>
     </w:p>
     <w:p>
+      <w:pPr>
+        <w:spacing w:before="0" w:after="40" w:line="240" w:lineRule="auto"/>
+        <w:ind w:left="0" w:right="0"/>
+      </w:pPr>
       <w:r>
         <w:pict w14:anchorId="334E4751">
           <v:rect id="_x0000_i1036" style="width:0;height:1.5pt" o:hralign="center" o:hrstd="t" o:hr="t"/>
@@ -862,84 +1498,147 @@
     <w:p>
       <w:pPr>
         <w:pStyle w:val="Titre3"/>
+        <w:spacing w:before="320" w:after="120" w:line="288" w:lineRule="auto"/>
+        <w:ind w:left="0" w:right="0"/>
       </w:pPr>
       <w:bookmarkStart w:id="14" w:name="étape-11-page-introuvable-optionnel"/>
       <w:bookmarkEnd w:id="13"/>
       <w:r>
+        <w:rPr>
+          <w:rFonts w:ascii="Segoe UI" w:hAnsi="Segoe UI" w:cs="Segoe UI" w:eastAsia="Segoe UI"/>
+          <w:b/>
+          <w:color w:val="007A8C"/>
+          <w:sz w:val="30"/>
+        </w:rPr>
         <w:t>Étape 11 — Page introuvable (optionnel)</w:t>
       </w:r>
     </w:p>
     <w:p>
       <w:pPr>
         <w:pStyle w:val="FirstParagraph"/>
-      </w:pPr>
-      <w:r>
-        <w:rPr>
+        <w:spacing w:before="40" w:after="160" w:line="324" w:lineRule="auto"/>
+        <w:ind w:left="0" w:right="0"/>
+      </w:pPr>
+      <w:r>
+        <w:rPr>
+          <w:rFonts w:ascii="Segoe UI" w:hAnsi="Segoe UI" w:cs="Segoe UI" w:eastAsia="Segoe UI"/>
           <w:b/>
           <w:bCs/>
+          <w:color w:val="0A192F"/>
+          <w:sz w:val="26"/>
         </w:rPr>
         <w:t>À faire</w:t>
       </w:r>
       <w:r>
+        <w:rPr>
+          <w:rFonts w:ascii="Segoe UI" w:hAnsi="Segoe UI" w:cs="Segoe UI" w:eastAsia="Segoe UI"/>
+          <w:b w:val="0"/>
+          <w:color w:val="0A192F"/>
+          <w:sz w:val="26"/>
+        </w:rPr>
         <w:t xml:space="preserve"> - Dans la barre d’adresse, ajoutez un chemin inventé (ex. </w:t>
       </w:r>
       <w:r>
         <w:rPr>
           <w:rStyle w:val="VerbatimChar"/>
+          <w:rFonts w:ascii="Segoe UI" w:hAnsi="Segoe UI" w:cs="Segoe UI" w:eastAsia="Segoe UI"/>
+          <w:b w:val="0"/>
+          <w:color w:val="0A192F"/>
+          <w:sz w:val="26"/>
         </w:rPr>
         <w:t>/page-qui-nexiste-pas</w:t>
       </w:r>
       <w:r>
+        <w:rPr>
+          <w:rFonts w:ascii="Segoe UI" w:hAnsi="Segoe UI" w:cs="Segoe UI" w:eastAsia="Segoe UI"/>
+          <w:b w:val="0"/>
+          <w:color w:val="0A192F"/>
+          <w:sz w:val="26"/>
+        </w:rPr>
         <w:t>) et validez. - Lire la page affichée, puis revenir à l’accueil via le lien proposé.</w:t>
       </w:r>
     </w:p>
     <w:p>
       <w:pPr>
         <w:pStyle w:val="Corpsdetexte"/>
-      </w:pPr>
-      <w:r>
-        <w:rPr>
+        <w:spacing w:before="120" w:after="280" w:line="324" w:lineRule="auto"/>
+        <w:ind w:left="255" w:right="198"/>
+        <w:shd w:val="clear" w:color="auto" w:fill="F3ECDA"/>
+        <w:pBdr>
+          <w:left w:val="single" w:sz="18" w:space="8" w:color="007A8C"/>
+        </w:pBdr>
+      </w:pPr>
+      <w:r>
+        <w:rPr>
+          <w:rFonts w:ascii="Segoe UI" w:hAnsi="Segoe UI" w:cs="Segoe UI" w:eastAsia="Segoe UI"/>
           <w:b/>
           <w:bCs/>
+          <w:color w:val="0A192F"/>
+          <w:sz w:val="26"/>
         </w:rPr>
         <w:lastRenderedPageBreak/>
         <w:t>Question</w:t>
       </w:r>
       <w:r>
         <w:rPr>
+          <w:rFonts w:ascii="Segoe UI" w:hAnsi="Segoe UI" w:cs="Segoe UI" w:eastAsia="Segoe UI"/>
           <w:b/>
           <w:bCs/>
+          <w:color w:val="0A192F"/>
+          <w:sz w:val="26"/>
         </w:rPr>
         <w:t xml:space="preserve"> :</w:t>
       </w:r>
       <w:r>
+        <w:rPr>
+          <w:rFonts w:ascii="Segoe UI" w:hAnsi="Segoe UI" w:cs="Segoe UI" w:eastAsia="Segoe UI"/>
+          <w:b w:val="0"/>
+          <w:color w:val="0A192F"/>
+          <w:sz w:val="26"/>
+        </w:rPr>
         <w:br/>
       </w:r>
       <w:r>
         <w:rPr>
+          <w:rFonts w:ascii="Segoe UI" w:hAnsi="Segoe UI" w:cs="Segoe UI" w:eastAsia="Segoe UI"/>
+          <w:b w:val="0"/>
           <w:i/>
           <w:iCs/>
+          <w:color w:val="0A192F"/>
+          <w:sz w:val="26"/>
         </w:rPr>
         <w:t xml:space="preserve">Ce message </w:t>
       </w:r>
       <w:proofErr w:type="spellStart"/>
       <w:r>
         <w:rPr>
+          <w:rFonts w:ascii="Segoe UI" w:hAnsi="Segoe UI" w:cs="Segoe UI" w:eastAsia="Segoe UI"/>
+          <w:b w:val="0"/>
           <w:i/>
           <w:iCs/>
+          <w:color w:val="0A192F"/>
+          <w:sz w:val="26"/>
         </w:rPr>
         <w:t>d’erreur</w:t>
       </w:r>
       <w:proofErr w:type="spellEnd"/>
       <w:r>
         <w:rPr>
+          <w:rFonts w:ascii="Segoe UI" w:hAnsi="Segoe UI" w:cs="Segoe UI" w:eastAsia="Segoe UI"/>
+          <w:b w:val="0"/>
           <w:i/>
           <w:iCs/>
+          <w:color w:val="0A192F"/>
+          <w:sz w:val="26"/>
         </w:rPr>
         <w:t xml:space="preserve"> vous a-t-il aidé à repartir facilement, ou avez-vous eu l’impression d’être bloqué·e ?</w:t>
       </w:r>
     </w:p>
     <w:p>
+      <w:pPr>
+        <w:spacing w:before="0" w:after="40" w:line="240" w:lineRule="auto"/>
+        <w:ind w:left="0" w:right="0"/>
+      </w:pPr>
       <w:r>
         <w:pict w14:anchorId="5D12B921">
           <v:rect id="_x0000_i1037" style="width:0;height:1.5pt" o:hralign="center" o:hrstd="t" o:hr="t"/>
@@ -949,11 +1648,22 @@
     <w:p>
       <w:pPr>
         <w:pStyle w:val="Titre2"/>
+        <w:spacing w:before="400" w:after="160" w:line="276" w:lineRule="auto"/>
+        <w:ind w:left="0" w:right="0"/>
+        <w:pBdr>
+          <w:bottom w:val="single" w:sz="18" w:space="8" w:color="007A8C"/>
+        </w:pBdr>
       </w:pPr>
       <w:bookmarkStart w:id="15" w:name="bilan-final-à-remplir-à-la-fin"/>
       <w:bookmarkEnd w:id="3"/>
       <w:bookmarkEnd w:id="14"/>
       <w:r>
+        <w:rPr>
+          <w:rFonts w:ascii="Segoe UI" w:hAnsi="Segoe UI" w:cs="Segoe UI" w:eastAsia="Segoe UI"/>
+          <w:b/>
+          <w:color w:val="02223F"/>
+          <w:sz w:val="36"/>
+        </w:rPr>
         <w:t>Bilan final (à remplir à la fin)</w:t>
       </w:r>
     </w:p>
@@ -964,11 +1674,17 @@
           <w:ilvl w:val="0"/>
           <w:numId w:val="4"/>
         </w:numPr>
-      </w:pPr>
-      <w:r>
-        <w:rPr>
+        <w:spacing w:before="20" w:after="120" w:line="312" w:lineRule="auto"/>
+        <w:ind w:left="198" w:right="0"/>
+      </w:pPr>
+      <w:r>
+        <w:rPr>
+          <w:rFonts w:ascii="Segoe UI" w:hAnsi="Segoe UI" w:cs="Segoe UI" w:eastAsia="Segoe UI"/>
+          <w:b w:val="0"/>
           <w:i/>
           <w:iCs/>
+          <w:color w:val="0A192F"/>
+          <w:sz w:val="26"/>
         </w:rPr>
         <w:t>En une phrase : recommanderiez-vous ce site à un proche curieux de la recherche en Nouvelle-Calédonie ? Pourquoi ?</w:t>
       </w:r>
@@ -980,11 +1696,17 @@
           <w:ilvl w:val="0"/>
           <w:numId w:val="4"/>
         </w:numPr>
-      </w:pPr>
-      <w:r>
-        <w:rPr>
+        <w:spacing w:before="20" w:after="120" w:line="312" w:lineRule="auto"/>
+        <w:ind w:left="198" w:right="0"/>
+      </w:pPr>
+      <w:r>
+        <w:rPr>
+          <w:rFonts w:ascii="Segoe UI" w:hAnsi="Segoe UI" w:cs="Segoe UI" w:eastAsia="Segoe UI"/>
+          <w:b w:val="0"/>
           <w:i/>
           <w:iCs/>
+          <w:color w:val="0A192F"/>
+          <w:sz w:val="26"/>
         </w:rPr>
         <w:t>Quels sont les 3 points forts que vous retenez ?</w:t>
       </w:r>
@@ -996,11 +1718,17 @@
           <w:ilvl w:val="0"/>
           <w:numId w:val="4"/>
         </w:numPr>
-      </w:pPr>
-      <w:r>
-        <w:rPr>
+        <w:spacing w:before="20" w:after="120" w:line="312" w:lineRule="auto"/>
+        <w:ind w:left="198" w:right="0"/>
+      </w:pPr>
+      <w:r>
+        <w:rPr>
+          <w:rFonts w:ascii="Segoe UI" w:hAnsi="Segoe UI" w:cs="Segoe UI" w:eastAsia="Segoe UI"/>
+          <w:b w:val="0"/>
           <w:i/>
           <w:iCs/>
+          <w:color w:val="0A192F"/>
+          <w:sz w:val="26"/>
         </w:rPr>
         <w:t>Quels sont les 3 points à améliorer en priorité ?</w:t>
       </w:r>
@@ -1012,16 +1740,26 @@
           <w:ilvl w:val="0"/>
           <w:numId w:val="4"/>
         </w:numPr>
-      </w:pPr>
-      <w:r>
-        <w:rPr>
+        <w:spacing w:before="20" w:after="120" w:line="312" w:lineRule="auto"/>
+        <w:ind w:left="198" w:right="0"/>
+      </w:pPr>
+      <w:r>
+        <w:rPr>
+          <w:rFonts w:ascii="Segoe UI" w:hAnsi="Segoe UI" w:cs="Segoe UI" w:eastAsia="Segoe UI"/>
+          <w:b w:val="0"/>
           <w:i/>
           <w:iCs/>
+          <w:color w:val="0A192F"/>
+          <w:sz w:val="26"/>
         </w:rPr>
         <w:t>Y a-t-il un moment où vous auriez abandonné si ce n’était pas un test ?</w:t>
       </w:r>
     </w:p>
     <w:p>
+      <w:pPr>
+        <w:spacing w:before="0" w:after="40" w:line="240" w:lineRule="auto"/>
+        <w:ind w:left="0" w:right="0"/>
+      </w:pPr>
       <w:r>
         <w:pict w14:anchorId="32550480">
           <v:rect id="_x0000_i1038" style="width:0;height:1.5pt" o:hralign="center" o:hrstd="t" o:hr="t"/>
@@ -1031,31 +1769,88 @@
     <w:p>
       <w:pPr>
         <w:pStyle w:val="FirstParagraph"/>
-      </w:pPr>
-      <w:r>
+        <w:spacing w:before="40" w:after="160" w:line="324" w:lineRule="auto"/>
+        <w:ind w:left="0" w:right="0"/>
+      </w:pPr>
+      <w:r>
+        <w:rPr>
+          <w:rFonts w:ascii="Segoe UI" w:hAnsi="Segoe UI" w:cs="Segoe UI" w:eastAsia="Segoe UI"/>
+          <w:b w:val="0"/>
+          <w:color w:val="0A192F"/>
+          <w:sz w:val="26"/>
+        </w:rPr>
         <w:t>Indiquez aussi : - Navigateur utilisé (Chrome, Firefox, Safari…) - Ordinateur ou téléphone - Durée approximative du test</w:t>
       </w:r>
     </w:p>
     <w:p>
       <w:pPr>
         <w:pStyle w:val="Corpsdetexte"/>
-      </w:pPr>
-      <w:r>
+        <w:spacing w:before="120" w:after="280" w:line="324" w:lineRule="auto"/>
+        <w:ind w:left="255" w:right="198"/>
+        <w:shd w:val="clear" w:color="auto" w:fill="F3ECDA"/>
+        <w:pBdr>
+          <w:left w:val="single" w:sz="18" w:space="8" w:color="007A8C"/>
+        </w:pBdr>
+      </w:pPr>
+      <w:r>
+        <w:rPr>
+          <w:rFonts w:ascii="Segoe UI" w:hAnsi="Segoe UI" w:cs="Segoe UI" w:eastAsia="Segoe UI"/>
+          <w:b w:val="0"/>
+          <w:color w:val="0A192F"/>
+          <w:sz w:val="26"/>
+        </w:rPr>
         <w:t>Merci : vos retours aident à améliorer Lab Horizon pour le grand public.</w:t>
       </w:r>
       <w:bookmarkEnd w:id="0"/>
       <w:bookmarkEnd w:id="15"/>
     </w:p>
     <w:sectPr>
+      <w:footerReference w:type="default" r:id="rId7"/>
+      <w:headerReference w:type="default" r:id="rId8"/>
       <w:footnotePr>
         <w:numRestart w:val="eachSect"/>
       </w:footnotePr>
-      <w:pgSz w:w="12240" w:h="15840"/>
-      <w:pgMar w:top="1417" w:right="1417" w:bottom="1417" w:left="1417" w:header="720" w:footer="720" w:gutter="0"/>
+      <w:pgSz w:w="11906" w:h="16838"/>
+      <w:pgMar w:top="964" w:right="1134" w:bottom="1020" w:left="1134" w:header="340" w:footer="283" w:gutter="0"/>
       <w:cols w:space="720"/>
     </w:sectPr>
   </w:body>
 </w:document>
+</file>
+
+<file path=word/footer1.xml><?xml version="1.0" encoding="utf-8"?>
+<w:ftr xmlns:m="http://schemas.openxmlformats.org/officeDocument/2006/math" xmlns:mc="http://schemas.openxmlformats.org/markup-compatibility/2006" xmlns:mo="http://schemas.microsoft.com/office/mac/office/2008/main" xmlns:mv="urn:schemas-microsoft-com:mac:vml" xmlns:o="urn:schemas-microsoft-com:office:office" xmlns:r="http://schemas.openxmlformats.org/officeDocument/2006/relationships" xmlns:v="urn:schemas-microsoft-com:vml" xmlns:w10="urn:schemas-microsoft-com:office:word" xmlns:w14="http://schemas.microsoft.com/office/word/2010/wordml" xmlns:w="http://schemas.openxmlformats.org/wordprocessingml/2006/main" xmlns:wne="http://schemas.microsoft.com/office/word/2006/wordml" xmlns:wp14="http://schemas.microsoft.com/office/word/2010/wordprocessingDrawing" xmlns:wp="http://schemas.openxmlformats.org/drawingml/2006/wordprocessingDrawing" xmlns:wpc="http://schemas.microsoft.com/office/word/2010/wordprocessingCanvas" xmlns:wpg="http://schemas.microsoft.com/office/word/2010/wordprocessingGroup" xmlns:wpi="http://schemas.microsoft.com/office/word/2010/wordprocessingInk" xmlns:wps="http://schemas.microsoft.com/office/word/2010/wordprocessingShape" mc:Ignorable="w14 wp14">
+  <w:p>
+    <w:pPr>
+      <w:pStyle w:val="Footer"/>
+      <w:spacing w:before="160" w:after="0" w:line="240" w:lineRule="auto"/>
+      <w:ind w:left="0" w:right="0"/>
+      <w:jc w:val="left"/>
+      <w:pBdr>
+        <w:top w:val="single" w:sz="18" w:space="8" w:color="007A8C"/>
+      </w:pBdr>
+    </w:pPr>
+    <w:r>
+      <w:rPr>
+        <w:rFonts w:ascii="Segoe UI" w:hAnsi="Segoe UI" w:cs="Segoe UI" w:eastAsia="Segoe UI"/>
+        <w:b/>
+        <w:color w:val="02223F"/>
+        <w:sz w:val="20"/>
+      </w:rPr>
+      <w:t>Lab Horizon</w:t>
+    </w:r>
+  </w:p>
+</w:ftr>
+</file>
+
+<file path=word/header1.xml><?xml version="1.0" encoding="utf-8"?>
+<w:hdr xmlns:m="http://schemas.openxmlformats.org/officeDocument/2006/math" xmlns:mc="http://schemas.openxmlformats.org/markup-compatibility/2006" xmlns:mo="http://schemas.microsoft.com/office/mac/office/2008/main" xmlns:mv="urn:schemas-microsoft-com:mac:vml" xmlns:o="urn:schemas-microsoft-com:office:office" xmlns:r="http://schemas.openxmlformats.org/officeDocument/2006/relationships" xmlns:v="urn:schemas-microsoft-com:vml" xmlns:w10="urn:schemas-microsoft-com:office:word" xmlns:w14="http://schemas.microsoft.com/office/word/2010/wordml" xmlns:w="http://schemas.openxmlformats.org/wordprocessingml/2006/main" xmlns:wne="http://schemas.microsoft.com/office/word/2006/wordml" xmlns:wp14="http://schemas.microsoft.com/office/word/2010/wordprocessingDrawing" xmlns:wp="http://schemas.openxmlformats.org/drawingml/2006/wordprocessingDrawing" xmlns:wpc="http://schemas.microsoft.com/office/word/2010/wordprocessingCanvas" xmlns:wpg="http://schemas.microsoft.com/office/word/2010/wordprocessingGroup" xmlns:wpi="http://schemas.microsoft.com/office/word/2010/wordprocessingInk" xmlns:wps="http://schemas.microsoft.com/office/word/2010/wordprocessingShape" mc:Ignorable="w14 wp14">
+  <w:p>
+    <w:pPr>
+      <w:pStyle w:val="Header"/>
+    </w:pPr>
+  </w:p>
+</w:hdr>
 </file>
 
 <file path=word/numbering.xml><?xml version="1.0" encoding="utf-8"?>
@@ -1660,6 +2455,15 @@
   <w:style w:type="paragraph" w:default="1" w:styleId="Normal">
     <w:name w:val="Normal"/>
     <w:qFormat/>
+    <w:pPr>
+      <w:spacing w:after="160" w:before="0" w:line="300" w:lineRule="auto"/>
+    </w:pPr>
+    <w:rPr>
+      <w:rFonts w:ascii="Segoe UI" w:hAnsi="Segoe UI" w:cs="Segoe UI" w:eastAsia="Segoe UI"/>
+      <w:b w:val="0"/>
+      <w:color w:val="0A192F"/>
+      <w:sz w:val="26"/>
+    </w:rPr>
   </w:style>
   <w:style w:type="paragraph" w:styleId="Titre1">
     <w:name w:val="heading 1"/>
@@ -1672,13 +2476,14 @@
     <w:pPr>
       <w:keepNext/>
       <w:keepLines/>
-      <w:spacing w:before="360" w:after="80"/>
+      <w:spacing w:before="0" w:after="120" w:line="300" w:lineRule="auto"/>
       <w:outlineLvl w:val="0"/>
     </w:pPr>
     <w:rPr>
-      <w:rFonts w:asciiTheme="majorHAnsi" w:eastAsiaTheme="majorEastAsia" w:hAnsiTheme="majorHAnsi" w:cstheme="majorBidi"/>
-      <w:color w:val="0F4761" w:themeColor="accent1" w:themeShade="BF"/>
-      <w:sz w:val="40"/>
+      <w:rFonts w:asciiTheme="majorHAnsi" w:eastAsiaTheme="majorEastAsia" w:hAnsiTheme="majorHAnsi" w:cstheme="majorBidi" w:ascii="Segoe UI" w:hAnsi="Segoe UI" w:cs="Segoe UI" w:eastAsia="Segoe UI"/>
+      <w:b/>
+      <w:color w:val="FFFFFF"/>
+      <w:sz w:val="52"/>
       <w:szCs w:val="40"/>
     </w:rPr>
   </w:style>
@@ -1695,13 +2500,14 @@
     <w:pPr>
       <w:keepNext/>
       <w:keepLines/>
-      <w:spacing w:before="160" w:after="80"/>
+      <w:spacing w:before="440" w:after="160" w:line="300" w:lineRule="auto"/>
       <w:outlineLvl w:val="1"/>
     </w:pPr>
     <w:rPr>
-      <w:rFonts w:asciiTheme="majorHAnsi" w:eastAsiaTheme="majorEastAsia" w:hAnsiTheme="majorHAnsi" w:cstheme="majorBidi"/>
-      <w:color w:val="0F4761" w:themeColor="accent1" w:themeShade="BF"/>
-      <w:sz w:val="32"/>
+      <w:rFonts w:asciiTheme="majorHAnsi" w:eastAsiaTheme="majorEastAsia" w:hAnsiTheme="majorHAnsi" w:cstheme="majorBidi" w:ascii="Segoe UI" w:hAnsi="Segoe UI" w:cs="Segoe UI" w:eastAsia="Segoe UI"/>
+      <w:b/>
+      <w:color w:val="02223F"/>
+      <w:sz w:val="36"/>
       <w:szCs w:val="32"/>
     </w:rPr>
   </w:style>
@@ -1718,13 +2524,14 @@
     <w:pPr>
       <w:keepNext/>
       <w:keepLines/>
-      <w:spacing w:before="160" w:after="80"/>
+      <w:spacing w:before="320" w:after="120" w:line="300" w:lineRule="auto"/>
       <w:outlineLvl w:val="2"/>
     </w:pPr>
     <w:rPr>
-      <w:rFonts w:eastAsiaTheme="majorEastAsia" w:cstheme="majorBidi"/>
-      <w:color w:val="0F4761" w:themeColor="accent1" w:themeShade="BF"/>
-      <w:sz w:val="28"/>
+      <w:rFonts w:eastAsiaTheme="majorEastAsia" w:cstheme="majorBidi" w:ascii="Segoe UI" w:hAnsi="Segoe UI" w:cs="Segoe UI" w:eastAsia="Segoe UI"/>
+      <w:b/>
+      <w:color w:val="007A8C"/>
+      <w:sz w:val="30"/>
       <w:szCs w:val="28"/>
     </w:rPr>
   </w:style>
@@ -1892,22 +2699,43 @@
     <w:basedOn w:val="Normal"/>
     <w:qFormat/>
     <w:pPr>
-      <w:spacing w:before="180" w:after="180"/>
+      <w:spacing w:before="80" w:after="160" w:line="300" w:lineRule="auto"/>
     </w:pPr>
+    <w:rPr>
+      <w:rFonts w:ascii="Segoe UI" w:hAnsi="Segoe UI" w:cs="Segoe UI" w:eastAsia="Segoe UI"/>
+      <w:b w:val="0"/>
+      <w:color w:val="0A192F"/>
+      <w:sz w:val="26"/>
+    </w:rPr>
   </w:style>
   <w:style w:type="paragraph" w:customStyle="1" w:styleId="FirstParagraph">
     <w:name w:val="First Paragraph"/>
     <w:basedOn w:val="Corpsdetexte"/>
     <w:next w:val="Corpsdetexte"/>
     <w:qFormat/>
+    <w:pPr>
+      <w:spacing w:before="40" w:after="160" w:line="300" w:lineRule="auto"/>
+    </w:pPr>
+    <w:rPr>
+      <w:rFonts w:ascii="Segoe UI" w:hAnsi="Segoe UI" w:cs="Segoe UI" w:eastAsia="Segoe UI"/>
+      <w:b w:val="0"/>
+      <w:color w:val="0A192F"/>
+      <w:sz w:val="26"/>
+    </w:rPr>
   </w:style>
   <w:style w:type="paragraph" w:customStyle="1" w:styleId="Compact">
     <w:name w:val="Compact"/>
     <w:basedOn w:val="Corpsdetexte"/>
     <w:qFormat/>
     <w:pPr>
-      <w:spacing w:before="36" w:after="36"/>
+      <w:spacing w:before="40" w:after="120" w:line="300" w:lineRule="auto"/>
     </w:pPr>
+    <w:rPr>
+      <w:rFonts w:ascii="Segoe UI" w:hAnsi="Segoe UI" w:cs="Segoe UI" w:eastAsia="Segoe UI"/>
+      <w:b w:val="0"/>
+      <w:color w:val="0A192F"/>
+      <w:sz w:val="26"/>
+    </w:rPr>
   </w:style>
   <w:style w:type="paragraph" w:styleId="Titre">
     <w:name w:val="Title"/>

</xml_diff>